<commit_message>
feat: unify Contrato Padrao with clauses from partner (Thomaz) service contract: late-payment penalty, tacit revision approval, maintenance SLA, liability/no-results disclaimer, no-employment-bond clause, filled jurisdiction clause (Jundiai); drop the 24-month mandatory term/early-termination penalty per client decision, keep maintenance cancel-anytime-no-penalty. Sync Termo de Manutencao Mensal with the same SLA. templates/ and public/templates/ now hold byte-identical content to avoid future drift. Remove now-dead jurisdiction context field.
</commit_message>
<xml_diff>
--- a/public/templates/termo-manutencao.docx
+++ b/public/templates/termo-manutencao.docx
@@ -208,6 +208,24 @@
           <w:szCs w:val="22"/>
         </w:rPr>
         <w:t xml:space="preserve">As solicitações não utilizadas no mês não acumulam para o mês seguinte.</w:t>
+      </w:r>
+    </w:p>
+    <w:p>
+      <w:pPr>
+        <w:pStyle w:val="ListParagraph"/>
+        <w:numPr>
+          <w:ilvl w:val="0"/>
+          <w:numId w:val="1"/>
+        </w:numPr>
+        <w:spacing w:after="70"/>
+      </w:pPr>
+      <w:r>
+        <w:rPr>
+          <w:rFonts w:ascii="Calibri" w:cs="Calibri" w:eastAsia="Calibri" w:hAnsi="Calibri"/>
+          <w:sz w:val="22"/>
+          <w:szCs w:val="22"/>
+        </w:rPr>
+        <w:t xml:space="preserve">As solicitações serão atendidas em até 3 (três) dias úteis a partir do recebimento, por WhatsApp ou e-mail.</w:t>
       </w:r>
     </w:p>
     <w:p>

</xml_diff>